<commit_message>
v16: embed exhibits 4-5 (sector comparison, subsidy scatterplot) in docx
- Insert exhibit_sector_comparison.png as Figure 4 in §5.3
  (DePIN vs DeFi box plot; DePIN 0.090, DeFi 0.043, p=0.031, d=0.96)
- Insert exhibit_subsidy_vs_hhi.png as Figure 7 in §5.6
  (LPT fragility; r=0.58 full, r=0.13 ex-LPT; TT expansion null r=0.095)
- Final renumber all 8 figures to sequential document order:
  old 4→5, 5→6, 6→8, new sector→4, new subsidy→7
- Final caption order: 1 conceptual, 2 framework, 3 HHI bar,
  4 sector, 5 alloc null, 6 delegation, 7 subsidy, 8 participation

Co-Authored-By: Claude Sonnet 4.6 <noreply@anthropic.com>
</commit_message>
<xml_diff>
--- a/paper/B2_Final_v16.docx
+++ b/paper/B2_Final_v16.docx
@@ -7294,6 +7294,56 @@
       </w:r>
     </w:p>
     <w:p>
+      <w:pPr>
+        <w:jc w:val="center"/>
+      </w:pPr>
+      <w:r>
+        <w:drawing xmlns:a="http://schemas.openxmlformats.org/drawingml/2006/main" xmlns:pic="http://schemas.openxmlformats.org/drawingml/2006/picture">
+          <wp:inline distT="0" distB="0" distL="0" distR="0">
+            <wp:extent cx="5943600" cy="4938770"/>
+            <wp:docPr id="107" name="Figure 4"/>
+            <a:graphic>
+              <a:graphicData uri="http://schemas.openxmlformats.org/drawingml/2006/picture">
+                <pic:pic>
+                  <pic:nvPicPr>
+                    <pic:cNvPr id="107" name="Figure 4"/>
+                    <pic:cNvPicPr/>
+                  </pic:nvPicPr>
+                  <pic:blipFill>
+                    <a:blip r:embed="rId16"/>
+                    <a:stretch>
+                      <a:fillRect/>
+                    </a:stretch>
+                  </pic:blipFill>
+                  <pic:spPr>
+                    <a:xfrm>
+                      <a:off x="0" y="0"/>
+                      <a:ext cx="5943600" cy="4938770"/>
+                    </a:xfrm>
+                    <a:prstGeom prst="rect">
+                      <a:avLst/>
+                    </a:prstGeom>
+                  </pic:spPr>
+                </pic:pic>
+              </a:graphicData>
+            </a:graphic>
+          </wp:inline>
+        </w:drawing>
+      </w:r>
+    </w:p>
+    <w:p>
+      <w:pPr>
+        <w:jc w:val="center"/>
+      </w:pPr>
+      <w:r>
+        <w:rPr>
+          <w:i/>
+          <w:sz w:val="20"/>
+        </w:rPr>
+        <w:t xml:space="preserve">Figure 4. Governance concentration (HHI) by sector. DePIN mean (0.090) exceeds DeFi mean (0.043), with distributions overlapping substantially: 8 of 15 DePIN protocols fall within the DeFi range. The Mann-Whitney test (p = 0.031, d = 0.96) is sensitive to sample composition (significant in 23 of 30 leave-one-out iterations).</w:t>
+      </w:r>
+    </w:p>
+    <w:p>
       <w:r>
         <w:rPr>
           <w:b w:val="0"/>
@@ -8534,12 +8584,12 @@
         <w:drawing xmlns:a="http://schemas.openxmlformats.org/drawingml/2006/main" xmlns:pic="http://schemas.openxmlformats.org/drawingml/2006/picture">
           <wp:inline distT="0" distB="0" distL="0" distR="0">
             <wp:extent cx="5029200" cy="3017520"/>
-            <wp:docPr id="104" name="Figure 4"/>
+            <wp:docPr id="104" name="Figure 5"/>
             <a:graphic>
               <a:graphicData uri="http://schemas.openxmlformats.org/drawingml/2006/picture">
                 <pic:pic>
                   <pic:nvPicPr>
-                    <pic:cNvPr id="104" name="Figure 4"/>
+                    <pic:cNvPr id="104" name="Figure 5"/>
                     <pic:cNvPicPr/>
                   </pic:nvPicPr>
                   <pic:blipFill>
@@ -8573,7 +8623,7 @@
           <w:i/>
           <w:sz w:val="20"/>
         </w:rPr>
-        <w:t xml:space="preserve">Figure 4. Insider allocation (%) vs. corrected holding HHI for 37 regression-ready protocols. The null relationship (r = 0.19, p = 0.25) is the paper’s lead finding: initial allocation design does not predict post-distribution governance concentration.</w:t>
+        <w:t xml:space="preserve">Figure 5. Insider allocation (%) vs. corrected holding HHI for 37 regression-ready protocols. The null relationship (r = 0.19, p = 0.25) is the paper’s lead finding: initial allocation design does not predict post-distribution governance concentration.</w:t>
       </w:r>
     </w:p>
     <w:p>
@@ -8628,12 +8678,12 @@
         <w:drawing xmlns:a="http://schemas.openxmlformats.org/drawingml/2006/main" xmlns:pic="http://schemas.openxmlformats.org/drawingml/2006/picture">
           <wp:inline distT="0" distB="0" distL="0" distR="0">
             <wp:extent cx="5029200" cy="2514600"/>
-            <wp:docPr id="105" name="Figure 5"/>
+            <wp:docPr id="105" name="Figure 6"/>
             <a:graphic>
               <a:graphicData uri="http://schemas.openxmlformats.org/drawingml/2006/picture">
                 <pic:pic>
                   <pic:nvPicPr>
-                    <pic:cNvPr id="105" name="Figure 5"/>
+                    <pic:cNvPr id="105" name="Figure 6"/>
                     <pic:cNvPicPr/>
                   </pic:nvPicPr>
                   <pic:blipFill>
@@ -8667,7 +8717,7 @@
           <w:i/>
           <w:sz w:val="20"/>
         </w:rPr>
-        <w:t xml:space="preserve">Figure 5. Raw holding HHI vs. delegation-adjusted HHI for five Tally-sourced protocols.</w:t>
+        <w:t xml:space="preserve">Figure 6. Raw holding HHI vs. delegation-adjusted HHI for five Tally-sourced protocols.</w:t>
       </w:r>
     </w:p>
     <w:p>
@@ -8675,7 +8725,7 @@
         <w:pStyle w:val="Normal"/>
       </w:pPr>
       <w:r>
-        <w:t xml:space="preserve">Figure 5 compares raw and delegation-adjusted HHI for five Tally-sourced protocols.</w:t>
+        <w:t xml:space="preserve">Figure 6 compares raw and delegation-adjusted HHI for five Tally-sourced protocols.</w:t>
       </w:r>
     </w:p>
     <w:p>
@@ -9707,6 +9757,56 @@
       </w:r>
     </w:p>
     <w:p>
+      <w:pPr>
+        <w:jc w:val="center"/>
+      </w:pPr>
+      <w:r>
+        <w:drawing xmlns:a="http://schemas.openxmlformats.org/drawingml/2006/main" xmlns:pic="http://schemas.openxmlformats.org/drawingml/2006/picture">
+          <wp:inline distT="0" distB="0" distL="0" distR="0">
+            <wp:extent cx="5943600" cy="3901077"/>
+            <wp:docPr id="108" name="Figure 7"/>
+            <a:graphic>
+              <a:graphicData uri="http://schemas.openxmlformats.org/drawingml/2006/picture">
+                <pic:pic>
+                  <pic:nvPicPr>
+                    <pic:cNvPr id="108" name="Figure 7"/>
+                    <pic:cNvPicPr/>
+                  </pic:nvPicPr>
+                  <pic:blipFill>
+                    <a:blip r:embed="rId17"/>
+                    <a:stretch>
+                      <a:fillRect/>
+                    </a:stretch>
+                  </pic:blipFill>
+                  <pic:spPr>
+                    <a:xfrm>
+                      <a:off x="0" y="0"/>
+                      <a:ext cx="5943600" cy="3901077"/>
+                    </a:xfrm>
+                    <a:prstGeom prst="rect">
+                      <a:avLst/>
+                    </a:prstGeom>
+                  </pic:spPr>
+                </pic:pic>
+              </a:graphicData>
+            </a:graphic>
+          </wp:inline>
+        </w:drawing>
+      </w:r>
+    </w:p>
+    <w:p>
+      <w:pPr>
+        <w:jc w:val="center"/>
+      </w:pPr>
+      <w:r>
+        <w:rPr>
+          <w:i/>
+          <w:sz w:val="20"/>
+        </w:rPr>
+        <w:t xml:space="preserve">Figure 7. Subsidy ratio (emissions/revenue) vs. governance concentration (HHI) for 20 protocols with on-chain subsidy data. Livepeer (diamond, 88.5x) is a 3.5-sigma outlier that alone drives the Pearson correlation from r = 0.13 (dashed line, excluding Livepeer) to r = 0.58 (solid line, full sample). The expanded Token Terminal sample (N = 22, Supplementary File S8) confirms the null at r = 0.095.</w:t>
+      </w:r>
+    </w:p>
+    <w:p>
       <w:r>
         <w:rPr>
           <w:b w:val="0"/>
@@ -9722,12 +9822,12 @@
         <w:drawing xmlns:a="http://schemas.openxmlformats.org/drawingml/2006/main" xmlns:pic="http://schemas.openxmlformats.org/drawingml/2006/picture">
           <wp:inline distT="0" distB="0" distL="0" distR="0">
             <wp:extent cx="5029200" cy="3017520"/>
-            <wp:docPr id="106" name="Figure 6"/>
+            <wp:docPr id="106" name="Figure 8"/>
             <a:graphic>
               <a:graphicData uri="http://schemas.openxmlformats.org/drawingml/2006/picture">
                 <pic:pic>
                   <pic:nvPicPr>
-                    <pic:cNvPr id="106" name="Figure 6"/>
+                    <pic:cNvPr id="106" name="Figure 8"/>
                     <pic:cNvPicPr/>
                   </pic:nvPicPr>
                   <pic:blipFill>
@@ -9761,7 +9861,7 @@
           <w:i/>
           <w:sz w:val="20"/>
         </w:rPr>
-        <w:t xml:space="preserve">Figure 6. HHI vs. voter participation rate for protocols with governance data.</w:t>
+        <w:t xml:space="preserve">Figure 8. HHI vs. voter participation rate for protocols with governance data.</w:t>
       </w:r>
     </w:p>
     <w:p>

</xml_diff>

<commit_message>
v16 final cleanup: the-the typo fix + duplicate outline paragraph deleted
Two edits applied to document.xml:
- Fix §2.7.3: removed duplicate 'the' in 'motivating the the call'
- Fix §1.1: deleted 389-char duplicate outline paragraph (Section 5/6/7 summary)

All 15 validation checks passed. 1.9MB, 8 embedded figures. SSRN-ready.

Co-Authored-By: Claude Sonnet 4.6 <noreply@anthropic.com>
</commit_message>
<xml_diff>
--- a/paper/B2_Final_v16.docx
+++ b/paper/B2_Final_v16.docx
@@ -189,11 +189,6 @@
       </w:r>
     </w:p>
     <w:p>
-      <w:r>
-        <w:t xml:space="preserve">Sections 2 and 3 develop the theoretical framework and design hypotheses. Section 4 operationalizes the framework through a scoring rubric and governance concentration cross-section design. Section 5 presents the empirical analysis. Sections 6 and 7 discuss implications, limitations, and future directions.</w:t>
-      </w:r>
-    </w:p>
-    <w:p>
       <w:pPr>
         <w:pStyle w:val="Heading2"/>
       </w:pPr>
@@ -1019,7 +1014,7 @@
     <w:p>
       <w:r>
         <w:rPr/>
-        <w:t>The capability approach (Sen, 1999; Nussbaum, 2011) provides a normative framework for evaluating social arrangements not by GDP or preferences alone, but by the real opportunities individuals have to achieve valued “doings and beings.” The SEP entry emphasizes capabilities and functionings as core evaluative concepts, motivating the the call to measure social impact beyond token price and TVL.</w:t>
+        <w:t>The capability approach (Sen, 1999; Nussbaum, 2011) provides a normative framework for evaluating social arrangements not by GDP or preferences alone, but by the real opportunities individuals have to achieve valued “doings and beings.” The SEP entry emphasizes capabilities and functionings as core evaluative concepts, motivating the call to measure social impact beyond token price and TVL.</w:t>
       </w:r>
     </w:p>
     <w:p>

</xml_diff>

<commit_message>
v16 editorial: 7 sentence repairs, 4 finding-first rewrites, 3 jargon defs
Sentence repairs: accepted track-change whitespace fixes for §4.5
(illustrates precisely) and §7.3 (snapshot: trajectory sentence).
Remaining A1-A4/A6 already correct in document.

Finding-first rewrites: §5.1 scope-first (40 protocols/4 sectors),
§5.2 HHI range lead (0.004 Axelar to 0.199 Livepeer), §5.5 delegation
amplification finding, §6.1 evidence-type summary.

Jargon defs: Blockscout (contract verification tool), Helius DAS API
(Digital Asset Standard interface), cadCAD (Python-based simulation framework).

Also accepted 23 prior tracked deletions + 27 insertions from prior session.

Co-Authored-By: Claude Sonnet 4.6 <noreply@anthropic.com>
</commit_message>
<xml_diff>
--- a/paper/B2_Final_v16.docx
+++ b/paper/B2_Final_v16.docx
@@ -64,16 +64,9 @@
         </w:rPr>
         <w:t>Governance concentration in token economies is not predicted by initial allocation design. A 40-protocol cross-section spanning DePIN, DeFi, infrastructure, and social token categories documents that the percentage of tokens allocated to team and investors at launch is uninformative about post-distribution governance concentration (r = 0.19, p = 0.25, N = 37): protocols with generous community distributions and those with heavy insider allocations produce indistinguishable concentration outcomes. Hyperliquid, the only protocol in the sample with zero venture capital and a 31% community airdrop, produces an HHI of 0.005, yet protocols with comparable concentration allocated two to five times more to insiders. The pattern is consistent with post-distribution market dynamics dominating structural design choices. Protocols with more insider wallets among their top holders exhibit higher concentration even among their non-insider holders (Spearman rho = 0.54, p = 0.001, N = 34),         </w:t>
       </w:r>
-      <w:del w:id="9052" w:author="Claude" w:date="2026-04-02T00:00:00Z">
-        <w:r>
-          <w:delText>suggesting a structural ecosystem effect beyond the mechanical contribution of large insider positions to concentration metrics.</w:delText>
-        </w:r>
-      </w:del>
-      <w:ins w:id="9053" w:author="Claude" w:date="2026-04-02T00:00:00Z">
-        <w:r>
-          <w:t>indicating that insider-heavy protocols have concentrated governance ecosystems, not merely concentrated insider positions.</w:t>
-        </w:r>
-      </w:ins>
+      <w:r>
+        <w:t>indicating that insider-heavy protocols have concentrated governance ecosystems, not merely concentrated insider positions.</w:t>
+      </w:r>
       <w:r>
         <w:t xml:space="preserve"> DePIN protocols exhibit higher concentration than DeFi protocols (Mann-Whitney p = 0.031, Cohen’s d = 0.96), a suggestive result sensitive to sample composition (significant in 23 of 30 leave-one-out iterations; permutation p = 0.029). On-chain subsidy intensity correlates with concentration in levels (Pearson r = 0.58, p = 0.007, N = 20) but this result is driven entirely by Livepeer (88.5x subsidy); excluding it renders the correlation insignificant (r = 0.13, p = 0.59). Token inequality is near-universal (Gini 0.73 to 0.98) but only moderately correlated with concentration (r = 0.54), confirming they capture distinct governance dimensions.</w:t>
       </w:r>
@@ -129,16 +122,9 @@
       <w:r>
         <w:t xml:space="preserve">Three protocols with nearly identical subsidy ratios (DIMO at 0.33x, Aethir at 0.36x, and Aave at 0.37x) have governance HHI values of 0.038, 0.171, and 0.020 respectively. All three are revenue-dominant, yet their concentration spans the full range of the 40-protocol sample.</w:t>
       </w:r>
-      <w:del w:id="9002" w:author="Claude" w:date="2026-04-02T00:00:00Z">
-        <w:r>
-          <w:delText>Governance concentration is a design outcome, not a financial outcome.</w:delText>
-        </w:r>
-      </w:del>
-      <w:ins w:id="9003" w:author="Claude" w:date="2026-04-02T00:00:00Z">
-        <w:r>
-          <w:t>Governance concentration is a secondary market outcome, shaped by post-distribution trading and accumulation dynamics that neither allocation design nor protocol financial characteristics predict.</w:t>
-        </w:r>
-      </w:ins>
+      <w:r>
+        <w:t>Governance concentration is a secondary market outcome, shaped by post-distribution trading and accumulation dynamics that neither allocation design nor protocol financial characteristics predict.</w:t>
+      </w:r>
       <w:r>
       </w:r>
     </w:p>
@@ -149,23 +135,16 @@
     </w:p>
     <w:p>
       <w:r>
-        <w:t>We construct a 40-protocol governance concentration dataset spanning DePIN and DeFi, develop a Blockscout-verified exclusion methodology to remove 69 protocol-controlled addresses (staking contracts, exchange custodians, vesting locks, and protocol treasuries) from HHI computation, and test every available cross-sectional predictor of concentration using both parametric and rank-based methods.</w:t>
+        <w:t>We construct a 40-protocol governance concentration dataset spanning DePIN and DeFi, develop a Blockscout-verified (a blockchain contract verification tool) exclusion methodology to remove 69 protocol-controlled addresses (staking contracts, exchange custodians, vesting locks, and protocol treasuries) from HHI computation, and test every available cross-sectional predictor of concentration using both parametric and rank-based methods.</w:t>
       </w:r>
     </w:p>
     <w:p>
       <w:r>
         <w:t xml:space="preserve">Four findings emerge. </w:t>
       </w:r>
-      <w:del w:id="9004" w:author="Claude" w:date="2026-04-02T00:00:00Z">
-        <w:r>
-          <w:delText>First, protocol-controlled address contamination is a field-wide measurement problem: 56 addresses across 17 protocols were masquerading as governance participants, and removing them changed affected protocols’ HHI by up to 5x.</w:delText>
-        </w:r>
-      </w:del>
-      <w:ins w:id="9005" w:author="Claude" w:date="2026-04-02T00:00:00Z">
-        <w:r>
-          <w:t>First, naive token holder lists include addresses that cannot vote: staking contracts, exchange custodians, vesting locks, and protocol treasuries. Across 20 protocols, 69 such addresses were included in prior concentration measurements, inflating affected protocols’ HHI by up to 5x.</w:t>
-        </w:r>
-      </w:ins>
+      <w:r>
+        <w:t>First, naive token holder lists include addresses that cannot vote: staking contracts, exchange custodians, vesting locks, and protocol treasuries. Across 20 protocols, 69 such addresses were included in prior concentration measurements, inflating affected protocols’ HHI by up to 5x.</w:t>
+      </w:r>
       <w:r>
         <w:t xml:space="preserve"> Second, current insider wallet retention predicts governance concentration (Spearman rho = 0.44, p = 0.005), while initial allocation design does not (r = 0.19, p = 0.25, N = 37). Third, DePIN governance concentration is higher than DeFi after exclusion correction (Mann-Whitney p = 0.031, Cohen’s d = 0.96), though this finding is sensitive to sample composition. Fourth, delegation amplifies concentration unevenly: DePIN protocols show voting-power HHI 3 to 6 times their holding HHI, while infrastructure protocols show the reverse pattern.</w:t>
       </w:r>
@@ -174,16 +153,9 @@
       <w:r>
         <w:t xml:space="preserve">These results extend the governance concentration literature (Barbereau et al., 2023; Feichtinger et al., 2023; Cong et al., 2025) in three directions: an exclusion methodology that corrects a systematic measurement artifact in prior work, a cross-sector null </w:t>
       </w:r>
-      <w:del w:id="9006" w:author="Claude" w:date="2026-04-02T00:00:00Z">
-        <w:r>
-          <w:delText>result that challenges financial explanations of concentration</w:delText>
-        </w:r>
-      </w:del>
-      <w:ins w:id="9007" w:author="Claude" w:date="2026-04-02T00:00:00Z">
-        <w:r>
-          <w:t>documenting that neither revenue, subsidy intensity, token maturity, nor initial allocation predicts governance concentration</w:t>
-        </w:r>
-      </w:ins>
+      <w:r>
+        <w:t>documenting that neither revenue, subsidy intensity, token maturity, nor initial allocation predicts governance concentration</w:t>
+      </w:r>
       <w:r>
         <w:t xml:space="preserve">, and a normative framework translating five political-philosophical traditions into evaluable design criteria for tokenized institutions. To evaluate what concentration means for institutional legitimacy, the framework operationalizes constraints from Kant (publicity), Rawls (floor protection), Pettit (non-domination), Ostrom (polycentricity), and Hayek (dispersed knowledge) through a replicable scoring rubric.</w:t>
       </w:r>
@@ -211,11 +183,9 @@
       </w:r>
     </w:p>
     <w:p>
-      <w:ins w:id="9008" w:author="Claude" w:date="2026-04-02T00:00:00Z">
-        <w:r>
-          <w:t>In practical terms: every decision about how tokens are distributed, who can vote, what can be changed, and how violations are punished is simultaneously an economic design choice and a political one.</w:t>
-        </w:r>
-      </w:ins>
+      <w:r>
+        <w:t>In practical terms: every decision about how tokens are distributed, who can vote, what can be changed, and how violations are punished is simultaneously an economic design choice and a political one.</w:t>
+      </w:r>
     </w:p>
     <w:p>
       <w:r>
@@ -546,16 +516,9 @@
         <w:rPr/>
         <w:t xml:space="preserve">Token systems </w:t>
       </w:r>
-      <w:del w:id="9009" w:author="Claude" w:date="2026-04-02T00:00:00Z">
-        <w:r>
-          <w:delText>are institution-like: they function as rule-governed systems</w:delText>
-        </w:r>
-      </w:del>
-      <w:ins w:id="9010" w:author="Claude" w:date="2026-04-02T00:00:00Z">
-        <w:r>
-          <w:t>function as institutions: rule-governed systems</w:t>
-        </w:r>
-      </w:ins>
+      <w:r>
+        <w:t>function as institutions: rule-governed systems</w:t>
+      </w:r>
       <w:r>
         <w:t xml:space="preserve"> with constitutional constraints, fiscal policy, property-like rights, and enforcement procedures. This framing parallels classic traditions in constitutional political economy (e.g., Buchanan and Tullock (1962)) and commons governance (Ostrom), while also drawing from political philosophy’s theories of legitimacy, justice, and domination. A key theme is that crypto networks differ from Web2 platforms not because they “lack governance,” but because they encode governance into public, inspectable mechanisms and often bind governance to ownership-like tokens.</w:t>
       </w:r>
@@ -738,16 +701,9 @@
         <w:rPr/>
         <w:t>The Bank for International Settlements (BIS) argues (Aramonte et al., 2021) that DeFi contains a “decentralization illusion,” emphasizing </w:t>
       </w:r>
-      <w:del w:id="9011" w:author="Claude" w:date="2026-04-02T00:00:00Z">
-        <w:r>
-          <w:delText>structural tendencies toward concentration due to governance needs and incentive structures.</w:delText>
-        </w:r>
-      </w:del>
-      <w:ins w:id="9012" w:author="Claude" w:date="2026-04-02T00:00:00Z">
-        <w:r>
-          <w:t>that protocols marketed as decentralized frequently concentrate decision-making power among a small number of token holders, developers, or validators.</w:t>
-        </w:r>
-      </w:ins>
+      <w:r>
+        <w:t>that protocols marketed as decentralized frequently concentrate decision-making power among a small number of token holders, developers, or validators.</w:t>
+      </w:r>
       <w:r>
         <w:t xml:space="preserve"> This critique is significant for this paper because it links governance concentration to systemic risks and questions the legitimacy of “decentralized” claims.</w:t>
       </w:r>
@@ -779,16 +735,9 @@
         <w:rPr/>
         <w:t>Voting power inequality in Compound, Uniswap, and ENS exceeds wealth inequality in real-world economies, with </w:t>
       </w:r>
-      <w:del w:id="9013" w:author="Claude" w:date="2026-04-02T00:00:00Z">
-        <w:r>
-          <w:delText>delegate Gini values approaching 0.99</w:delText>
-        </w:r>
-      </w:del>
-      <w:ins w:id="9014" w:author="Claude" w:date="2026-04-02T00:00:00Z">
-        <w:r>
-          <w:t>voting power more unequally distributed than income in any country</w:t>
-        </w:r>
-      </w:ins>
+      <w:r>
+        <w:t>voting power more unequally distributed than income in any country</w:t>
+      </w:r>
       <w:r>
         <w:t xml:space="preserve"> (Fritsch, Müller, &amp; Wattenhofer, 2024), a pattern consistent with the delegation amplification documented in Section 5.5; notably, these concentrated delegates rarely overturn community-preferred outcomes, suggesting that concentration creates domination risk rather than routine domination. Across 10,639 proposals in 151 DAOs, three or fewer entities exert effective control over most governance decisions (Appel &amp; Grennan, 2023), consistent with the insider dominance this paper documents at the token-holder level.</w:t>
       </w:r>
@@ -876,7 +825,7 @@
         <w:rPr/>
       </w:r>
       <w:r>
-        <w:t xml:space="preserve"> Separate simulation work stress-tests DePIN mechanism designs under adversarial conditions using cadCAD, demonstrating that mechanism-level choices (emission model, slashing parameters) produce macro-level institutional outcomes that the normative framework developed here can evaluate.</w:t>
+        <w:t xml:space="preserve"> Separate simulation work stress-tests DePIN mechanism designs under adversarial conditions using cadCAD (a Python-based simulation framework), demonstrating that mechanism-level choices (emission model, slashing parameters) produce macro-level institutional outcomes that the normative framework developed here can evaluate.</w:t>
       </w:r>
     </w:p>
     <w:p>
@@ -1343,16 +1292,9 @@
         <w:rPr/>
         <w:t xml:space="preserve">Sink: </w:t>
       </w:r>
-      <w:del w:id="9015" w:author="Claude" w:date="2026-04-02T00:00:00Z">
-        <w:r>
-          <w:delText>float-reducing mechanisms (burns, buybacks that retire tokens, locks that credibly reduce circulating float over the window).</w:delText>
-        </w:r>
-      </w:del>
-      <w:ins w:id="9016" w:author="Claude" w:date="2026-04-02T00:00:00Z">
-        <w:r>
-          <w:t>mechanisms that permanently or temporarily remove tokens from circulation (burns, buybacks that retire tokens, locks that reduce tradeable supply).</w:t>
-        </w:r>
-      </w:ins>
+      <w:r>
+        <w:t>mechanisms that permanently or temporarily remove tokens from circulation (burns, buybacks that retire tokens, locks that reduce tradeable supply).</w:t>
+      </w:r>
       <w:r>
         <w:br/>
         <w:t>A system exhibits “sink before faucet” discipline if sinks are deployed and observable before (or alongside) large-scale faucets.</w:t>
@@ -1510,16 +1452,9 @@
         <w:rPr/>
         <w:t xml:space="preserve">A system </w:t>
       </w:r>
-      <w:del w:id="9017" w:author="Claude" w:date="2026-04-02T00:00:00Z">
-        <w:r>
-          <w:delText>is legitimacy-feasible if</w:delText>
-        </w:r>
-      </w:del>
-      <w:ins w:id="9018" w:author="Claude" w:date="2026-04-02T00:00:00Z">
-        <w:r>
-          <w:t>satisfies its legitimacy constraints if</w:t>
-        </w:r>
-      </w:ins>
+      <w:r>
+        <w:t>satisfies its legitimacy constraints if</w:t>
+      </w:r>
       <w:r>
         <w:t xml:space="preserve"> (Π) and (ℰ) satisfy (ℒ) under plausible adversarial conditions.</w:t>
       </w:r>
@@ -2319,29 +2254,15 @@
         <w:rPr/>
         <w:t>Protocols were selected to maximize variation across three dimensions: sector (15 DeFi, 15 DePIN, 8 L1/L2 infrastructure, </w:t>
       </w:r>
-      <w:del w:id="9019" w:author="Claude" w:date="2026-04-02T00:00:00Z">
-        <w:r>
-          <w:delText>2 survivorship-bias controls</w:delText>
-        </w:r>
-      </w:del>
-      <w:ins w:id="9020" w:author="Claude" w:date="2026-04-02T00:00:00Z">
-        <w:r>
-          <w:t>2 failed or stagnated protocols included to avoid studying only survivors</w:t>
-        </w:r>
-      </w:ins>
+      <w:r>
+        <w:t>2 failed or stagnated protocols included to avoid studying only survivors</w:t>
+      </w:r>
       <w:r>
         <w:t xml:space="preserve">), maturity (2017-2024 launches), and governance model (token-weighted, delegate, futarchy). The expanded 40-protocol sample was constructed by adding protocols from the Dune Analytics ecosystem that met three criteria: (i) publicly traded governance token, (ii) holder data queryable via Dune or Helius DAS API, and (iii) at least 50 non-zero-balance holders after protocol-controlled address exclusion. MetaDAO is included as the sole futarchy-governance protocol in the sample.         </w:t>
       </w:r>
-      <w:del w:id="9021" w:author="Claude" w:date="2026-04-02T00:00:00Z">
-        <w:r>
-          <w:delText>Solana-native tokens (META, DRIFT, GRASS, W) were collected via Helius getTokenAccounts API to address systematic undercounting in Dune's solana_utils.daily_balances table, which returned 29-291 holders versus 5,067-99,980 from direct RPC enumeration.</w:delText>
-        </w:r>
-      </w:del>
-      <w:ins w:id="9022" w:author="Claude" w:date="2026-04-02T00:00:00Z">
-        <w:r>
-          <w:t>Solana-native tokens (META, DRIFT, GRASS, W) required a separate data collection pipeline (Helius DAS API) because the primary indexer undercounted holders by two orders of magnitude; details are in Supplementary File S6.</w:t>
-        </w:r>
-      </w:ins>
+      <w:r>
+        <w:t>Solana-native tokens (META, DRIFT, GRASS, W) required a separate data collection pipeline (Helius DAS API) because the primary indexer undercounted holders by two orders of magnitude; details are in Supplementary File S6.</w:t>
+      </w:r>
       <w:r>
         <w:t/>
       </w:r>
@@ -2436,12 +2357,10 @@
         <w:rPr/>
         <w:t xml:space="preserve">Financial covariates (revenue, treasury, market capitalization) are sourced from Token Terminal, DeFiLlama, and CoinGecko APIs and are subject to each aggregator's coverage limitations. Token allocation data were compiled from official protocol documentation and verified against Tokenomist for all 38 protocols; source URLs are documented in the replication package. We cross-validate allocation data against the Tokenomist API for the 10 protocols available under the free-trial catalog. Seven of nine matched protocols agree within three percentage points; two discrepancies (Aave, Lido) reflect Tokenomist’s reporting of current vesting state rather than initial allocation design, a distinction that reinforces the separation between design intent and observed holder composition documented in Section 5.4. Two protocols (MetaDAO, Token Engineering Commons) use non-standard allocation models that cannot be mapped to team/investor/community buckets and are excluded from the allocation regression.</w:t>
       </w:r>
-      <w:ins w:id="1" w:author="Claude" w:date="2026-04-01T00:00:00Z">
-        <w:r>
-          <w:rPr/>
-          <w:t xml:space="preserve"> Balancer (BAL) is included in the regression analysis but excluded from the concentration summary table; its veBAL vote-escrow mechanism makes raw token HHI non-comparable with one-token-one-vote protocols, so it is omitted from the cross-sectional concentration statistics but retained where covariate coverage is sufficient.</w:t>
-        </w:r>
-      </w:ins>
+      <w:r>
+        <w:rPr/>
+        <w:t xml:space="preserve"> Balancer (BAL) is included in the regression analysis but excluded from the concentration summary table; its veBAL vote-escrow mechanism makes raw token HHI non-comparable with one-token-one-vote protocols, so it is omitted from the cross-sectional concentration statistics but retained where covariate coverage is sufficient.</w:t>
+      </w:r>
       <w:r>
         <w:rPr/>
         <w:t xml:space="preserve"> Treasury data is available from DeFiLlama for DeFi and L1/L2 infrastructure protocols but not for DePIN protocols, which manage treasury through multisig wallets not indexed by aggregators. DePIN network device counts are sourced from DePINScan, Messari quarterly reports, and protocol explorers; these counts are point-in-time snapshots subject to measurement differences across implementations (e.g., Helium separates IoT and Mobile subnetworks; Filecoin distinguishes active storage providers from historical registrations; Livepeer caps its active orchestrator set at 100 by protocol design).</w:t>
@@ -2540,16 +2459,9 @@
         <w:rPr/>
         <w:t>: on/off-chain, delegation, thresholds, quorums, timelocks, veto/guardian.; Participation costs: </w:t>
       </w:r>
-      <w:del w:id="9040" w:author="Claude" w:date="2026-04-02T00:00:00Z">
-        <w:r>
-          <w:delText>cost-to-meaningful-voice proxies.</w:delText>
-        </w:r>
-      </w:del>
-      <w:ins w:id="9041" w:author="Claude" w:date="2026-04-02T00:00:00Z">
-        <w:r>
-          <w:t>the minimum token holding or gas expenditure required to submit a governance proposal or cast a meaningful vote.</w:t>
-        </w:r>
-      </w:ins>
+      <w:r>
+        <w:t>the minimum token holding or gas expenditure required to submit a governance proposal or cast a meaningful vote.</w:t>
+      </w:r>
       <w:r>
         <w:t/>
       </w:r>
@@ -3134,11 +3046,9 @@
         </w:rPr>
         <w:t>The governance concentration analysis uses three primary metrics. We compute the Herfindahl-Hirschman Index (HHI) over the distribution of governance token holdings across unique addresses. HHI ranges from 0 (perfectly dispersed) to 1 (single holder); values above 0.25 indicate high concentration by antitrust standards </w:t>
       </w:r>
-      <w:ins w:id="9023" w:author="Claude" w:date="2026-04-02T00:00:00Z">
-        <w:r>
-          <w:t>(for reference, a market with four equal competitors has HHI = 0.25)</w:t>
-        </w:r>
-      </w:ins>
+      <w:r>
+        <w:t>(for reference, a market with four equal competitors has HHI = 0.25)</w:t>
+      </w:r>
       <w:r>
         <w:t xml:space="preserve">. The Gini coefficient measures inequality in the same distribution, ranging from 0 (perfect equality) to 1 (maximum inequality). Top-N concentration ratios (Top-1, Top-5, Top-10 share) complement HHI by identifying specific whale addresses.</w:t>
       </w:r>
@@ -3150,16 +3060,9 @@
         </w:rPr>
         <w:t>The Synergy Index aggregates the philosophical lens scores (Section 3) into a composite measure of institutional design quality. For each protocol, the Synergy Index is the mean of the five lens scores (Kantian publicity, Rawlsian fairness, republican non-domination, Ostromian polycentricity, Hayekian knowledge-use), each scored 0 to 3 per the rubric in Table 1.         </w:t>
       </w:r>
-      <w:del w:id="9024" w:author="Claude" w:date="2026-04-02T00:00:00Z">
-        <w:r>
-          <w:delText>The Index is designed to correlate with governance quality but is not a causal claim: a high Synergy Index reflects that a protocol's institutional design aligns with multiple normative traditions, not that such alignment causes good outcomes.</w:delText>
-        </w:r>
-      </w:del>
-      <w:ins w:id="9025" w:author="Claude" w:date="2026-04-02T00:00:00Z">
-        <w:r>
-          <w:t>A high Synergy Index indicates that a protocol’s institutional design aligns with multiple normative traditions; it measures design intent, not governance effectiveness.</w:t>
-        </w:r>
-      </w:ins>
+      <w:r>
+        <w:t>A high Synergy Index indicates that a protocol’s institutional design aligns with multiple normative traditions; it measures design intent, not governance effectiveness.</w:t>
+      </w:r>
       <w:r>
         <w:t xml:space="preserve"> Three additional normative dimensions discussed in the literature review (capabilities, contextual integrity, cosmopolitan inclusion) serve as future evaluation criteria but are not included in the Synergy Index due to incomplete and non-comparable measurement across protocols in the current sample.</w:t>
       </w:r>
@@ -3222,7 +3125,7 @@
         <w:rPr>
           <w:b w:val="0"/>
         </w:rPr>
-        <w:t>Claims boundary (Table 3): We execute one empirical analysis from the full pipeline specified in Section 4.7: a cross-sectional governance concentration comparison across 40 protocols. All claims are descriptive within the observed scope. The governance data represent a March 2026 snapshot, not a time series. Causal claims about the relationship between institutional design and governance outcomes require the longitudinal evidence beyond the scope of this paper. All governance token distributions were queried from Dune Analytics multi-chain queries. Concentration metrics are point-in-time snapshots; trajectory analysis requires the longitudinal extension specified in Section 7.4.</w:t>
+        <w:t>The cross-section covers 40 protocols across four sectors (DePIN, DeFi, infrastructure, social). Table 3 delimits the claims boundary: all findings are descriptive within the observed scope. All claims are descriptive within the observed scope. The governance data represent a March 2026 snapshot, not a time series. Causal claims about the relationship between institutional design and governance outcomes require the longitudinal evidence beyond the scope of this paper. All governance token distributions were queried from Dune Analytics multi-chain queries. Concentration metrics are point-in-time snapshots; trajectory analysis requires the longitudinal extension specified in Section 7.4.</w:t>
       </w:r>
     </w:p>
     <w:tbl>
@@ -3396,7 +3299,7 @@
         <w:rPr>
           <w:b w:val="0"/>
         </w:rPr>
-        <w:t>Table 4 reports governance concentration for 40 protocols, computed from Dune Analytics multi-chain queries and Helius DAS API token holder distributions (March 2026 snapshot) Subsidy-to-Revenue ratios for DePIN protocols were computed from protocol-native burn and emission events using the compute_s2r.py script in the replication package; input files include helium_s2r_cleaned.csv (34 months), geodnet_monthly_burns.csv, and geodnet_monthly_emissions.csv.. We report address-holding concentration after excluding 69 protocol-controlled addresses across 20 protocols (see Section 5.1a). Solana-native tokens were collected via Helius getTokenAccounts with page-based pagination to correct systematic undercounting in Dune's indexed tables.</w:t>
+        <w:t>HHI ranges from 0.004 (Axelar) to 0.199 (Livepeer) across 40 protocols (Table 4), computed from Dune Analytics multi-chain queries and Helius DAS API (Solana’s Digital Asset Standard interface for token holder enumeration) token holder distributions (March 2026 snapshot) Subsidy-to-Revenue ratios for DePIN protocols were computed from protocol-native burn and emission events using the compute_s2r.py script in the replication package; input files include helium_s2r_cleaned.csv (34 months), geodnet_monthly_burns.csv, and geodnet_monthly_emissions.csv.. We report address-holding concentration after excluding 69 protocol-controlled addresses across 20 protocols (see Section 5.1a). Solana-native tokens were collected via Helius getTokenAccounts with page-based pagination to correct systematic undercounting in Dune's indexed tables.</w:t>
       </w:r>
     </w:p>
     <w:p>
@@ -7274,16 +7177,9 @@
         </w:rPr>
         <w:t>DePIN protocols exhibit higher governance concentration than DeFi protocols in the expanded 40-protocol dataset (Mann-Whitney p = 0.031, Cohen’s d = 0.96). DePIN mean HHI (0.090, N=15) exceeds DeFi mean HHI (0.043, N=15). The result is sensitive to sample composition and should be characterized as suggestive rather than robust; the test remains significant in 23 of 30 leave-one-out iterations, with seven protocols individually capable of pushing the p-value above 0.052. A permutation test (10,000 random reassignments of sector labels) yields p = 0.029, confirming the direction is not an artifact of the asymptotic approximation.         </w:t>
       </w:r>
-      <w:del w:id="9028" w:author="Claude" w:date="2026-04-02T00:00:00Z">
-        <w:r>
-          <w:delText>Formal analysis of capital-intensive networks demonstrates that even small asymmetries in operational costs produce highly concentrated market shares (Arnosti &amp; Weinberg, 2022); DePIN protocols, where fleet operators achieve lower per-unit costs than solo participants through scale economies, exhibit this oligopoly structure (Cohen’s d = 0.96 relative to DeFi).</w:delText>
-        </w:r>
-      </w:del>
-      <w:ins w:id="9029" w:author="Claude" w:date="2026-04-02T00:00:00Z">
-        <w:r>
-          <w:t>In capital-intensive networks, even small cost advantages produce concentrated market shares (Arnosti &amp; Weinberg, 2022). DePIN protocols exhibit this pattern: fleet operators who deploy hundreds of devices achieve lower per-unit costs than solo participants, and the resulting scale economies are consistent with the concentration gap observed here (Cohen’s d = 0.96 relative to DeFi).</w:t>
-        </w:r>
-      </w:ins>
+      <w:r>
+        <w:t>In capital-intensive networks, even small cost advantages produce concentrated market shares (Arnosti &amp; Weinberg, 2022). DePIN protocols exhibit this pattern: fleet operators who deploy hundreds of devices achieve lower per-unit costs than solo participants, and the resulting scale economies are consistent with the concentration gap observed here (Cohen’s d = 0.96 relative to DeFi).</w:t>
+      </w:r>
       <w:r>
         <w:t/>
       </w:r>
@@ -7367,29 +7263,15 @@
         </w:rPr>
         <w:t>The distribution design explanation is consistent with practitioner evidence from points-based token distribution programs (Sawinyh, 2025). Mature DeFi protocols distributed tokens through multi-season liquidity mining programs, safety module staking, and delegation incentives that implement sub-linear scaling (diminishing returns per marginal dollar deposited), activity-based caps, and time-weighted multipliers; these mechanisms structurally compress holding concentration over years. DePIN protocols that allocated tokens through conventional venture rounds, reserving 30 to 50 percent for founding teams and early investors with cliff-based vesting, bypassed these </w:t>
       </w:r>
-      <w:del w:id="9030" w:author="Claude" w:date="2026-04-02T00:00:00Z">
-        <w:r>
-          <w:delText>compression</w:delText>
-        </w:r>
-      </w:del>
-      <w:ins w:id="9031" w:author="Claude" w:date="2026-04-02T00:00:00Z">
-        <w:r>
-          <w:t>distribution-broadening</w:t>
-        </w:r>
-      </w:ins>
+      <w:r>
+        <w:t>distribution-broadening</w:t>
+      </w:r>
       <w:r>
         <w:t xml:space="preserve"> mechanisms entirely. The governance concentration patterns in Table 4 may reflect distribution mechanism design rather than sector-level differences. However, the regression null on insider allocation (Section 5.4) cautions against treating initial token allocation as a </w:t>
       </w:r>
-      <w:del w:id="9032" w:author="Claude" w:date="2026-04-02T00:00:00Z">
-        <w:r>
-          <w:delText>sufficient statistic for</w:delText>
-        </w:r>
-      </w:del>
-      <w:ins w:id="9033" w:author="Claude" w:date="2026-04-02T00:00:00Z">
-        <w:r>
-          <w:t>complete measure of</w:t>
-        </w:r>
-      </w:ins>
+      <w:r>
+        <w:t>complete measure of</w:t>
+      </w:r>
       <w:r>
         <w:t xml:space="preserve"> distribution design: compression mechanisms (sub-linear scaling, activity-based caps, delegation incentives) operate through ongoing protocol governance, not through the initial percentage split alone.</w:t>
       </w:r>
@@ -8557,16 +8439,9 @@
         </w:rPr>
         <w:t>The divergence between allocation design (null) and current insider presence (descriptive mechanism) carries a design implication. Governance concentration is not determined at launch; it emerges from post-distribution dynamics. Protocols whose insiders retain their positions produce more concentrated governance outcomes, regardless of how generously the initial allocation was designed. The count-based tautology check (rho = 0.54 on non-insider HHI) suggests this is not merely arithmetic: insider-heavy protocols attract or retain concentrated non-insider holders as well, consistent with </w:t>
       </w:r>
-      <w:del w:id="9034" w:author="Claude" w:date="2026-04-02T00:00:00Z">
-        <w:r>
-          <w:delText>an ecosystem-level concentration effect rather than a purely mechanical one.</w:delText>
-        </w:r>
-      </w:del>
-      <w:ins w:id="9035" w:author="Claude" w:date="2026-04-02T00:00:00Z">
-        <w:r>
-          <w:t>a pattern where concentrated insider presence attracts or coexists with concentrated non-insider holders, rather than insider balances alone inflating the metric.</w:t>
-        </w:r>
-      </w:ins>
+      <w:r>
+        <w:t>a pattern where concentrated insider presence attracts or coexists with concentrated non-insider holders, rather than insider balances alone inflating the metric.</w:t>
+      </w:r>
       <w:r>
         <w:t/>
       </w:r>
@@ -8622,14 +8497,12 @@
       </w:r>
     </w:p>
     <w:p>
-      <w:ins w:id="9001" w:author="Claude" w:date="2026-04-01T00:00:00Z">
-        <w:r>
-          <w:rPr>
-            <w:b w:val="0"/>
-          </w:rPr>
-          <w:t>Hyperliquid provides the strongest available test of the allocation design hypothesis. The protocol accepted zero venture capital, distributed 31% of total supply via a single community airdrop (the largest in crypto history by dollar value), and operates a deflationary model where 97% of trading fees purchase and burn the native token; it has no ongoing emissions. Five protocol-controlled addresses were excluded from the HHI computation: the Assistance Fund system address (confirmed in Hyperliquid documentation), the burn address, the community rewards treasury (241 million tokens, matching the published allocation), the Foundation treasury (60 million tokens, exactly 6% of total supply), and the staking manager contract (confirmed via Hypurrscan). The resulting HHI of 0.005 is the second-lowest in the DeFi subsample, after Compound (0.003). Despite the most community-favorable distribution architecture in the sample, Hyperliquid’s governance concentration is indistinguishable from the DeFi mean (0.043), consistent with the finding that allocation design does not predict post-distribution concentration.</w:t>
-        </w:r>
-      </w:ins>
+      <w:r>
+        <w:rPr>
+          <w:b w:val="0"/>
+        </w:rPr>
+        <w:t>Hyperliquid provides the strongest available test of the allocation design hypothesis. The protocol accepted zero venture capital, distributed 31% of total supply via a single community airdrop (the largest in crypto history by dollar value), and operates a deflationary model where 97% of trading fees purchase and burn the native token; it has no ongoing emissions. Five protocol-controlled addresses were excluded from the HHI computation: the Assistance Fund system address (confirmed in Hyperliquid documentation), the burn address, the community rewards treasury (241 million tokens, matching the published allocation), the Foundation treasury (60 million tokens, exactly 6% of total supply), and the staking manager contract (confirmed via Hypurrscan). The resulting HHI of 0.005 is the second-lowest in the DeFi subsample, after Compound (0.003). Despite the most community-favorable distribution architecture in the sample, Hyperliquid’s governance concentration is indistinguishable from the DeFi mean (0.043), consistent with the finding that allocation design does not predict post-distribution concentration.</w:t>
+      </w:r>
     </w:p>
     <w:p>
       <w:r>
@@ -8654,7 +8527,7 @@
         <w:pStyle w:val="Normal"/>
       </w:pPr>
       <w:r>
-        <w:t xml:space="preserve">The holding-based HHI reported in Table 4 measures token distribution, not governance power. For protocols with delegation, a small number of delegates may control voting power far exceeding their personal holdings. To quantify this gap, we collected delegated voting power from Tally (on-chain governance: Compound, Aave, Uniswap, Optimism, Arbitrum) and Snapshot (off-chain governance: DIMO, WeatherXM, Lido) for the 8 protocols with sufficient governance activity in the 12 months preceding the snapshot.</w:t>
+        <w:t xml:space="preserve">Delegation amplifies DePIN governance concentration 3 to 6 times above holding levels, while infrastructure protocols show the reverse pattern (Table 6). The holding-based HHI reported in Table 4 measures token distribution, not governance power. For protocols with delegation, a small number of delegates may control voting power far exceeding their personal holdings. To quantify this gap, we collected delegated voting power from Tally (on-chain governance: Compound, Aave, Uniswap, Optimism, Arbitrum) and Snapshot (off-chain governance: DIMO, WeatherXM, Lido) for the 8 protocols with sufficient governance activity in the 12 months preceding the snapshot.</w:t>
       </w:r>
     </w:p>
     <w:p>
@@ -9877,7 +9750,7 @@
     </w:p>
     <w:p>
       <w:r>
-        <w:t xml:space="preserve">Rather than evaluating each hypothesis in isolation, we organize the evidence thematically: what the governance data directly demonstrate, what they constrain but cannot confirm, and what lies beyond the current evidence base. </w:t>
+        <w:t xml:space="preserve">The governance cross-section provides descriptive evidence for two hypotheses (publicity, contestability), indirect evidence for two (adaptivity, polycentricity), and identifies three evidence frontiers (capability, contextual integrity, cosmopolitanism). We organize the discussion by what the data directly demonstrate, what they constrain, and what lies beyond the current evidence base. </w:t>
       </w:r>
     </w:p>
     <w:p>
@@ -9893,16 +9766,9 @@
       <w:r>
         <w:t>Indirect signals: structural constraints on adaptivity (Hypotheses 3.4 and 3.5). The service-over-presence hypothesis (3.4) and the polycentric adaptation hypothesis (3.5) posit that governance structures incorporating diverse, edge-level input produce more adaptive systems. The HHI cross-section cannot test these claims directly because it measures token concentration, not governance structure diversity or information flow. However, the data reveal a structural constraint:         </w:t>
       </w:r>
-      <w:del w:id="9036" w:author="Claude" w:date="2026-04-02T00:00:00Z">
-        <w:r>
-          <w:delText>edge-participant voice is suppressed when holdings are concentrated.</w:delText>
-        </w:r>
-      </w:del>
-      <w:ins w:id="9037" w:author="Claude" w:date="2026-04-02T00:00:00Z">
-        <w:r>
-          <w:t>the operators and users closest to the service (those with the most relevant operational knowledge) cannot influence governance decisions if they hold small token positions.</w:t>
-        </w:r>
-      </w:ins>
+      <w:r>
+        <w:t>the operators and users closest to the service (those with the most relevant operational knowledge) cannot influence governance decisions if they hold small token positions.</w:t>
+      </w:r>
       <w:r>
         <w:t/>
         <w:br/>
@@ -9910,16 +9776,9 @@
         <w:br/>
         <w:t>The finding that delegation design affects concentration also indicates that polycentric features (subDAOs, councils, delegation hierarchies) may reduce effective concentration without requiring redistribution. Evidence grade: indirect; the concentration data identify structural constraints on adaptivity, but the adaptive mechanism itself requires longitudinal evidence beyond the scope of this cross-section. A companion simulation (Zukowski, 2026e) calibrated to Helium parameters documents that </w:t>
       </w:r>
-      <w:del w:id="9038" w:author="Claude" w:date="2026-04-02T00:00:00Z">
-        <w:r>
-          <w:delText>PID-controlled emission compresses node-count variance by sixfold across a 240-run Monte Carlo ensemble, raising the 5th-percentile node count from 1,049 (static emission) to 8,880 (PID-controlled). The mechanism’s primary value is floor-raising: it prevents the worst outcomes rather than improving averages, consistent with the Rawlsian fairness lens’s emphasis on protecting the least advantaged.</w:delText>
-        </w:r>
-      </w:del>
-      <w:ins w:id="9039" w:author="Claude" w:date="2026-04-02T00:00:00Z">
-        <w:r>
-          <w:t>an adaptive emission controller (calibrated to Helium parameters in a 240-run simulation) reduces the spread of network size outcomes by sixfold compared to fixed emission schedules, raising the worst-case network size from approximately 1,000 nodes to approximately 9,000. The mechanism’s primary value is preventing collapse rather than improving averages, consistent with the Rawlsian fairness principle of protecting the least advantaged.</w:t>
-        </w:r>
-      </w:ins>
+      <w:r>
+        <w:t>an adaptive emission controller (calibrated to Helium parameters in a 240-run simulation) reduces the spread of network size outcomes by sixfold compared to fixed emission schedules, raising the worst-case network size from approximately 1,000 nodes to approximately 9,000. The mechanism’s primary value is preventing collapse rather than improving averages, consistent with the Rawlsian fairness principle of protecting the least advantaged.</w:t>
+      </w:r>
       <w:r>
         <w:t/>
       </w:r>
@@ -9965,16 +9824,9 @@
         <w:rPr/>
         <w:t>Low Barriers and Diverse Participation Governance concentration across 40 protocols with valid data (Gini 0.45–0.99; Table 4; Livepeer excluded </w:t>
       </w:r>
-      <w:del w:id="9026" w:author="Claude" w:date="2026-04-02T00:00:00Z">
-        <w:r>
-          <w:delText>due to bridge-schema measurement failure</w:delText>
-        </w:r>
-      </w:del>
-      <w:ins w:id="9027" w:author="Claude" w:date="2026-04-02T00:00:00Z">
-        <w:r>
-          <w:t>because its cross-chain bridge architecture prevents accurate Gini computation from single-chain holder data</w:t>
-        </w:r>
-      </w:ins>
+      <w:r>
+        <w:t>because its cross-chain bridge architecture prevents accurate Gini computation from single-chain holder data</w:t>
+      </w:r>
       <w:r>
         <w:t xml:space="preserve">) shows that token-weighted voting creates steep participation inequality by default. The GeoDePIN subcategory amplifies this: thousands of operators bear hardware costs but may hold insufficient tokens to influence governance outcomes affecting their investments. Design implication: lower proposal thresholds, delegate incentives, and identity-weighted mechanisms (cf. Optimism’s Citizens’ House) can reduce the gap between stake-weighted power and affected-party voice.</w:t>
       </w:r>
@@ -10068,16 +9920,9 @@
         </w:rPr>
         <w:t>Philosophical overreach. Translating normative philosophy into scoring rubrics necessarily simplifies rich traditions. A 0-to-3 scale cannot capture the full depth of Kantian moral reasoning or Rawlsian justice theory. The rubric is designed as a tractable approximation that makes legitimacy evaluable, not as a claim that it captures everything these traditions offer. Users should treat scores as </w:t>
       </w:r>
-      <w:del w:id="9042" w:author="Claude" w:date="2026-04-02T00:00:00Z">
-        <w:r>
-          <w:delText>structured signals, not verdicts.</w:delText>
-        </w:r>
-      </w:del>
-      <w:ins w:id="9043" w:author="Claude" w:date="2026-04-02T00:00:00Z">
-        <w:r>
-          <w:t>comparable indicators, not definitive judgments.</w:t>
-        </w:r>
-      </w:ins>
+      <w:r>
+        <w:t>comparable indicators, not definitive judgments.</w:t>
+      </w:r>
       <w:r>
         <w:t/>
       </w:r>
@@ -10122,18 +9967,11 @@
         <w:t xml:space="preserve">Equity-token conflicts.</w:t>
       </w:r>
       <w:r>
-        <w:t xml:space="preserve"> The normative framework assumes that governance token holders are the primary principals, but hybrid structures complicate this assumption. Helium's unresolved tension between Nova Labs' equity obligations and HNT tokenholders' interests (Bane &amp; Gala, 2026), exemplified by temporary revenue-allocation policies and subsequent reversions, illustrates precisely         </w:t>
-      </w:r>
-      <w:del w:id="9044" w:author="Claude" w:date="2026-04-02T00:00:00Z">
-        <w:r>
-          <w:delText>the parameter-setting legitimacy deficit that the framework diagnoses under Hypotheses 3.1 and 3.2.</w:delText>
-        </w:r>
-      </w:del>
-      <w:ins w:id="9045" w:author="Claude" w:date="2026-04-02T00:00:00Z">
-        <w:r>
-          <w:t>the tension between centralized operational decisions and decentralized governance that Hypotheses 3.1 (transparency) and 3.2 (contestability) are designed to address.</w:t>
-        </w:r>
-      </w:ins>
+        <w:t xml:space="preserve"> The normative framework assumes that governance token holders are the primary principals, but hybrid structures complicate this assumption. Helium's unresolved tension between Nova Labs' equity obligations and HNT tokenholders' interests (Bane &amp; Gala, 2026), exemplified by temporary revenue-allocation policies and subsequent reversions, illustrates precisely </w:t>
+      </w:r>
+      <w:r>
+        <w:t xml:space="preserve">the tension between centralized operational decisions and decentralized governance that Hypotheses 3.1 (transparency) and 3.2 (contestability) are designed to address.</w:t>
+      </w:r>
       <w:r>
         <w:t/>
       </w:r>
@@ -10218,16 +10056,9 @@
       <w:r>
         <w:t xml:space="preserve">        </w:t>
       </w:r>
-      <w:del w:id="9046" w:author="Claude" w:date="2026-04-02T00:00:00Z">
-        <w:r>
-          <w:delText>DePIN protocols span a 268-fold subsidy range, from DIMO (0.33x, revenue-dominant) to Livepeer (88.5x, heavily subsidized).</w:delText>
-        </w:r>
-      </w:del>
-      <w:ins w:id="9047" w:author="Claude" w:date="2026-04-02T00:00:00Z">
-        <w:r>
-          <w:t>DePIN protocols vary enormously in their dependence on token subsidies: DIMO earns three times more in revenue than it pays in token rewards (subsidy ratio 0.33x), while Livepeer pays 88 times more in rewards than it earns (88.5x).</w:t>
-        </w:r>
-      </w:ins>
+      <w:r>
+        <w:t>DePIN protocols vary enormously in their dependence on token subsidies: DIMO earns three times more in revenue than it pays in token rewards (subsidy ratio 0.33x), while Livepeer pays 88 times more in rewards than it earns (88.5x).</w:t>
+      </w:r>
       <w:r>
         <w:t xml:space="preserve"> Despite this range, concentration does not track subsidy in any robust specification. Two pattern-breaking protocols are instructive: Aethir generates the highest DePIN revenue ($156M annualized (Token Terminal, April 2026)) yet has the second-highest HHI (0.171), consistent with team and vesting wallet concentration in an early-stage protocol. Hivemapper operates at 5.46x subsidy yet has the lowest HHI among expansion protocols (0.020), consistent with broad geographic distribution of 90,000+ dashcam operators. These cases suggest that governance concentration reflects initial token allocation and operator-base structure rather than ongoing financial sustainability.</w:t>
       </w:r>
@@ -10236,16 +10067,9 @@
       <w:r>
         <w:t>Table 7 reports multivariate OLS regressions of HHI on protocol characteristics. The DePIN coefficient is positive across all specifications (Model 1: +0.028, p = 0.07, N = 24) but does not reach conventional significance. No individual covariate achieves p &lt; 0.10. The adjusted R-squared ranges from 0.01 to 0.08, confirming that measured covariates explain very little cross-sectional variation. The sample (N = 24 to 33 depending on specification) is </w:t>
       </w:r>
-      <w:del w:id="9048" w:author="Claude" w:date="2026-04-02T00:00:00Z">
-        <w:r>
-          <w:delText>underpowered for multivariate inference;</w:delText>
-        </w:r>
-      </w:del>
-      <w:ins w:id="9049" w:author="Claude" w:date="2026-04-02T00:00:00Z">
-        <w:r>
-          <w:t>too small to reliably estimate the independent effect of each variable when controlling for the others;</w:t>
-        </w:r>
-      </w:ins>
+      <w:r>
+        <w:t>too small to reliably estimate the independent effect of each variable when controlling for the others;</w:t>
+      </w:r>
       <w:r>
         <w:t xml:space="preserve"> the pipeline specification (Supplementary File S5) documents the infrastructure for replication at larger sample sizes.</w:t>
       </w:r>
@@ -10284,18 +10108,11 @@
         <w:rPr>
           <w:b w:val="0"/>
         </w:rPr>
-        <w:t>The evidence carries several limitations. The governance concentration analysis is a March 2026 snapshot:         </w:t>
-      </w:r>
-      <w:del w:id="9050" w:author="Claude" w:date="2026-04-02T00:00:00Z">
-        <w:r>
-          <w:delText>concentration trajectories over time would enable deconcentration analysis and strengthen causal claims.</w:delText>
-        </w:r>
-      </w:del>
-      <w:ins w:id="9051" w:author="Claude" w:date="2026-04-02T00:00:00Z">
-        <w:r>
-          <w:t>tracking concentration over time would reveal whether protocols are becoming more or less concentrated and strengthen causal claims.</w:t>
-        </w:r>
-      </w:ins>
+        <w:t>The evidence carries several limitations. The governance concentration analysis is a March 2026 snapshot: </w:t>
+      </w:r>
+      <w:r>
+        <w:t xml:space="preserve">tracking concentration over time would reveal whether protocols are becoming more or less concentrated and strengthen causal claims.</w:t>
+      </w:r>
       <w:r>
         <w:t xml:space="preserve"> A single scorer has applied the scoring rubric; inter-rater reliability testing with independent scorers is needed before the rubric can claim measurement validity beyond its current proof-of-concept status. The sample of 40 protocols is sufficient for descriptive comparison but too small for robust regression analysis; the pipeline specification (Supplementary File S5) is designed for expansion to 20+ protocols. The sample includes only active protocols, introducing potential survivorship bias (see Section 4.3 for planned inclusion of stagnated projects). We have not validated the Synergy Index against outcome measures; Partial validation through case evidence is reported separately, but a full validation study is future work.</w:t>
       </w:r>

</xml_diff>